<commit_message>
docs: update technical doc with connection dot, accessibility FAB, hamburger menu and centered matriz
</commit_message>
<xml_diff>
--- a/Documentacion_Tecnica_ProyectoFinal_ISW521.docx
+++ b/Documentacion_Tecnica_ProyectoFinal_ISW521.docx
@@ -7441,89 +7441,48 @@
           <w:bCs/>
           <w:color w:val="C0392B"/>
         </w:rPr>
-        <w:lastRenderedPageBreak/>
-        <w:t xml:space="preserve">Qué expone: </w:t>
-      </w:r>
-      <w:proofErr w:type="spellStart"/>
-      <w:r>
-        <w:t>WC.ui</w:t>
-      </w:r>
-      <w:proofErr w:type="spellEnd"/>
-      <w:r>
-        <w:t xml:space="preserve"> (el, </w:t>
-      </w:r>
-      <w:proofErr w:type="spellStart"/>
-      <w:r>
-        <w:t>icon</w:t>
-      </w:r>
-      <w:proofErr w:type="spellEnd"/>
-      <w:r>
-        <w:t xml:space="preserve">, </w:t>
-      </w:r>
-      <w:proofErr w:type="spellStart"/>
-      <w:r>
-        <w:t>staleBadge</w:t>
-      </w:r>
-      <w:proofErr w:type="spellEnd"/>
-      <w:r>
-        <w:t xml:space="preserve">, </w:t>
-      </w:r>
-      <w:proofErr w:type="spellStart"/>
-      <w:r>
-        <w:t>skeleton</w:t>
-      </w:r>
-      <w:proofErr w:type="spellEnd"/>
-      <w:r>
-        <w:t xml:space="preserve">, </w:t>
-      </w:r>
-      <w:proofErr w:type="spellStart"/>
-      <w:r>
-        <w:t>errorNotice</w:t>
-      </w:r>
-      <w:proofErr w:type="spellEnd"/>
-      <w:r>
-        <w:t xml:space="preserve">, </w:t>
-      </w:r>
-      <w:proofErr w:type="spellStart"/>
-      <w:r>
-        <w:t>subtabs</w:t>
-      </w:r>
-      <w:proofErr w:type="spellEnd"/>
-      <w:r>
-        <w:t xml:space="preserve">, chip, </w:t>
-      </w:r>
-      <w:proofErr w:type="spellStart"/>
-      <w:r>
-        <w:t>wireBannerToApi</w:t>
-      </w:r>
-      <w:proofErr w:type="spellEnd"/>
-      <w:r>
-        <w:t xml:space="preserve">, </w:t>
-      </w:r>
-      <w:proofErr w:type="spellStart"/>
-      <w:r>
-        <w:t>showAuthOverlay</w:t>
-      </w:r>
-      <w:proofErr w:type="spellEnd"/>
-      <w:r>
-        <w:t xml:space="preserve">, </w:t>
-      </w:r>
-      <w:proofErr w:type="spellStart"/>
-      <w:r>
-        <w:t>closeAuthOverlay</w:t>
-      </w:r>
-      <w:proofErr w:type="spellEnd"/>
-      <w:r>
-        <w:t xml:space="preserve">, </w:t>
-      </w:r>
-      <w:proofErr w:type="spellStart"/>
-      <w:r>
-        <w:t>setAuthSuccessHandler</w:t>
-      </w:r>
-      <w:proofErr w:type="spellEnd"/>
-      <w:r>
-        <w:t>).</w:t>
-      </w:r>
+        <w:t>Qué expone: WC.ui (el, icon, staleBadge, skeleton, errorNotice, subtabs, chip, connectionDot, wireBannerToApi, showAuthOverlay, closeAuthOverlay, setAuthSuccessHandler).</w:t>
+      </w:r>
+      <w:proofErr w:type="spellStart"/>
+      <w:r/>
+      <w:proofErr w:type="spellEnd"/>
+      <w:r/>
+      <w:proofErr w:type="spellStart"/>
+      <w:r/>
+      <w:proofErr w:type="spellEnd"/>
+      <w:r/>
+      <w:proofErr w:type="spellStart"/>
+      <w:r/>
+      <w:proofErr w:type="spellEnd"/>
+      <w:r/>
+      <w:proofErr w:type="spellStart"/>
+      <w:r/>
+      <w:proofErr w:type="spellEnd"/>
+      <w:r/>
+      <w:proofErr w:type="spellStart"/>
+      <w:r/>
+      <w:proofErr w:type="spellEnd"/>
+      <w:r/>
+      <w:proofErr w:type="spellStart"/>
+      <w:r/>
+      <w:proofErr w:type="spellEnd"/>
+      <w:r/>
+      <w:proofErr w:type="spellStart"/>
+      <w:r/>
+      <w:proofErr w:type="spellEnd"/>
+      <w:r/>
+      <w:proofErr w:type="spellStart"/>
+      <w:r/>
+      <w:proofErr w:type="spellEnd"/>
+      <w:r/>
+      <w:proofErr w:type="spellStart"/>
+      <w:r/>
+      <w:proofErr w:type="spellEnd"/>
+      <w:r/>
+      <w:proofErr w:type="spellStart"/>
+      <w:r/>
+      <w:proofErr w:type="spellEnd"/>
+      <w:r/>
     </w:p>
     <w:p>
       <w:pPr>
@@ -9256,6 +9215,106 @@
           </w:p>
         </w:tc>
       </w:tr>
+      <w:tr>
+        <w:tblPrEx>
+          <w:tblCellMar>
+            <w:top w:w="0" w:type="dxa"/>
+            <w:bottom w:w="0" w:type="dxa"/>
+          </w:tblCellMar>
+        </w:tblPrEx>
+        <w:tc>
+          <w:tcPr>
+            <w:tcW w:w="2900" w:type="dxa"/>
+            <w:tcMar>
+              <w:top w:w="60" w:type="dxa"/>
+              <w:left w:w="110" w:type="dxa"/>
+              <w:bottom w:w="60" w:type="dxa"/>
+              <w:right w:w="110" w:type="dxa"/>
+            </w:tcMar>
+          </w:tcPr>
+          <w:p>
+            <w:proofErr w:type="spellStart"/>
+            <w:r>
+              <w:rPr>
+                <w:rFonts w:ascii="Consolas" w:eastAsia="Consolas" w:hAnsi="Consolas" w:cs="Consolas"/>
+                <w:b/>
+                <w:bCs/>
+                <w:color w:val="8E44AD"/>
+                <w:sz w:val="18"/>
+                <w:szCs w:val="18"/>
+              </w:rPr>
+              <w:t>connectionDot() / updateConnDot(dot)</w:t>
+            </w:r>
+            <w:proofErr w:type="spellEnd"/>
+            <w:r>
+              <w:rPr>
+                <w:rFonts w:ascii="Consolas" w:eastAsia="Consolas" w:hAnsi="Consolas" w:cs="Consolas"/>
+                <w:b/>
+                <w:bCs/>
+                <w:color w:val="8E44AD"/>
+                <w:sz w:val="18"/>
+                <w:szCs w:val="18"/>
+              </w:rPr>
+            </w:r>
+            <w:proofErr w:type="spellStart"/>
+            <w:r>
+              <w:rPr>
+                <w:rFonts w:ascii="Consolas" w:eastAsia="Consolas" w:hAnsi="Consolas" w:cs="Consolas"/>
+                <w:b/>
+                <w:bCs/>
+                <w:color w:val="8E44AD"/>
+                <w:sz w:val="18"/>
+                <w:szCs w:val="18"/>
+              </w:rPr>
+            </w:r>
+            <w:proofErr w:type="spellEnd"/>
+            <w:r>
+              <w:rPr>
+                <w:rFonts w:ascii="Consolas" w:eastAsia="Consolas" w:hAnsi="Consolas" w:cs="Consolas"/>
+                <w:b/>
+                <w:bCs/>
+                <w:color w:val="8E44AD"/>
+                <w:sz w:val="18"/>
+                <w:szCs w:val="18"/>
+              </w:rPr>
+            </w:r>
+          </w:p>
+        </w:tc>
+        <w:tc>
+          <w:tcPr>
+            <w:tcW w:w="6460" w:type="dxa"/>
+            <w:tcMar>
+              <w:top w:w="60" w:type="dxa"/>
+              <w:left w:w="110" w:type="dxa"/>
+              <w:bottom w:w="60" w:type="dxa"/>
+              <w:right w:w="110" w:type="dxa"/>
+            </w:tcMar>
+          </w:tcPr>
+          <w:p>
+            <w:r>
+              <w:rPr>
+                <w:sz w:val="20"/>
+                <w:szCs w:val="20"/>
+              </w:rPr>
+              <w:t>Indicador de conexión: crea un punto que refleja navigator.onLine (verde = en línea, rojo pulsante = sin conexión) y se actualiza con los eventos window online/offline. Queda siempre visible junto al botón Salir.</w:t>
+            </w:r>
+            <w:proofErr w:type="spellStart"/>
+            <w:r>
+              <w:rPr>
+                <w:sz w:val="20"/>
+                <w:szCs w:val="20"/>
+              </w:rPr>
+            </w:r>
+            <w:proofErr w:type="spellEnd"/>
+            <w:r>
+              <w:rPr>
+                <w:sz w:val="20"/>
+                <w:szCs w:val="20"/>
+              </w:rPr>
+            </w:r>
+          </w:p>
+        </w:tc>
+      </w:tr>
     </w:tbl>
     <w:p>
       <w:pPr>
@@ -9283,11 +9342,9 @@
           <w:bCs/>
           <w:color w:val="C0392B"/>
         </w:rPr>
-        <w:t xml:space="preserve">Rol: </w:t>
-      </w:r>
-      <w:r>
-        <w:t>Arranque de la app + router de pestañas (SPA) + tema claro/oscuro + controles de accesibilidad (tamaño de letra) + cerrar sesión. Es el orquestador que conecta todo.</w:t>
-      </w:r>
+        <w:t>Rol: Arranque de la app + router de pestañas (SPA, con menú hamburguesa en pantallas pequeñas) + tema claro/oscuro + controles de accesibilidad (tamaño de letra) reubicados en un botón flotante + cerrar sesión. Es el orquestador que conecta todo.</w:t>
+      </w:r>
+      <w:r/>
     </w:p>
     <w:p>
       <w:pPr>
@@ -9392,52 +9449,29 @@
           <w:bCs/>
           <w:color w:val="C0392B"/>
         </w:rPr>
-        <w:lastRenderedPageBreak/>
-        <w:t xml:space="preserve">Constantes/estado: </w:t>
-      </w:r>
-      <w:r>
-        <w:t xml:space="preserve">TABS = 5 pestañas (tour, agenda, timeline, dashboard, matriz). Estado: </w:t>
-      </w:r>
-      <w:proofErr w:type="spellStart"/>
-      <w:r>
-        <w:t>viewRoot</w:t>
-      </w:r>
-      <w:proofErr w:type="spellEnd"/>
-      <w:r>
-        <w:t xml:space="preserve">, </w:t>
-      </w:r>
-      <w:proofErr w:type="spellStart"/>
-      <w:r>
-        <w:t>tabList</w:t>
-      </w:r>
-      <w:proofErr w:type="spellEnd"/>
-      <w:r>
-        <w:t xml:space="preserve">, </w:t>
-      </w:r>
-      <w:proofErr w:type="spellStart"/>
-      <w:r>
-        <w:t>themeBtn</w:t>
-      </w:r>
-      <w:proofErr w:type="spellEnd"/>
-      <w:r>
-        <w:t xml:space="preserve">, </w:t>
-      </w:r>
-      <w:proofErr w:type="spellStart"/>
-      <w:r>
-        <w:t>logoutBtn</w:t>
-      </w:r>
-      <w:proofErr w:type="spellEnd"/>
-      <w:r>
-        <w:t xml:space="preserve">, </w:t>
-      </w:r>
-      <w:proofErr w:type="spellStart"/>
-      <w:r>
-        <w:t>current</w:t>
-      </w:r>
-      <w:proofErr w:type="spellEnd"/>
-      <w:r>
-        <w:t>. Accesibilidad: FONT_MIN=80, FONT_MAX=150, FONT_STEP=10, FONT_DEFAULT=100.</w:t>
-      </w:r>
+        <w:t>Constantes/estado: TABS = 5 pestañas (tour, agenda, timeline, dashboard, matriz). Estado: viewRoot, tabList, themeBtn, logoutBtn, current, tabsWrapEl, tabsBurgerEl. Accesibilidad: FONT_MIN=80, FONT_MAX=150, FONT_STEP=10, FONT_DEFAULT=100.</w:t>
+      </w:r>
+      <w:r/>
+      <w:proofErr w:type="spellStart"/>
+      <w:r/>
+      <w:proofErr w:type="spellEnd"/>
+      <w:r/>
+      <w:proofErr w:type="spellStart"/>
+      <w:r/>
+      <w:proofErr w:type="spellEnd"/>
+      <w:r/>
+      <w:proofErr w:type="spellStart"/>
+      <w:r/>
+      <w:proofErr w:type="spellEnd"/>
+      <w:r/>
+      <w:proofErr w:type="spellStart"/>
+      <w:r/>
+      <w:proofErr w:type="spellEnd"/>
+      <w:r/>
+      <w:proofErr w:type="spellStart"/>
+      <w:r/>
+      <w:proofErr w:type="spellEnd"/>
+      <w:r/>
     </w:p>
     <w:p>
       <w:pPr>
@@ -10379,39 +10413,35 @@
                 <w:sz w:val="20"/>
                 <w:szCs w:val="20"/>
               </w:rPr>
-              <w:t xml:space="preserve">Construye el armazón: el </w:t>
-            </w:r>
-            <w:proofErr w:type="spellStart"/>
-            <w:r>
-              <w:rPr>
-                <w:sz w:val="20"/>
-                <w:szCs w:val="20"/>
-              </w:rPr>
-              <w:t>hero</w:t>
-            </w:r>
-            <w:proofErr w:type="spellEnd"/>
-            <w:r>
-              <w:rPr>
-                <w:sz w:val="20"/>
-                <w:szCs w:val="20"/>
-              </w:rPr>
-              <w:t xml:space="preserve"> con los controles (A-, A, A+ de accesibilidad, botón de tema y botón Salir), las pestañas, el contenedor de la vista y el </w:t>
-            </w:r>
-            <w:proofErr w:type="spellStart"/>
-            <w:r>
-              <w:rPr>
-                <w:sz w:val="20"/>
-                <w:szCs w:val="20"/>
-              </w:rPr>
-              <w:t>footer</w:t>
-            </w:r>
-            <w:proofErr w:type="spellEnd"/>
-            <w:r>
-              <w:rPr>
-                <w:sz w:val="20"/>
-                <w:szCs w:val="20"/>
-              </w:rPr>
-              <w:t>.</w:t>
+              <w:t>Construye el armazón: el hero (que ahora sólo lleva el botón Salir y el punto de conexión, para no tapar el título), las pestañas con su botón hamburguesa, el contenedor de la vista, el footer y el botón flotante de accesibilidad.</w:t>
+            </w:r>
+            <w:proofErr w:type="spellStart"/>
+            <w:r>
+              <w:rPr>
+                <w:sz w:val="20"/>
+                <w:szCs w:val="20"/>
+              </w:rPr>
+            </w:r>
+            <w:proofErr w:type="spellEnd"/>
+            <w:r>
+              <w:rPr>
+                <w:sz w:val="20"/>
+                <w:szCs w:val="20"/>
+              </w:rPr>
+            </w:r>
+            <w:proofErr w:type="spellStart"/>
+            <w:r>
+              <w:rPr>
+                <w:sz w:val="20"/>
+                <w:szCs w:val="20"/>
+              </w:rPr>
+            </w:r>
+            <w:proofErr w:type="spellEnd"/>
+            <w:r>
+              <w:rPr>
+                <w:sz w:val="20"/>
+                <w:szCs w:val="20"/>
+              </w:rPr>
             </w:r>
           </w:p>
         </w:tc>
@@ -10557,6 +10587,274 @@
                 <w:szCs w:val="20"/>
               </w:rPr>
               <w:t xml:space="preserve"> de SESSION_EXPIRED (que muestra el modal). Si hay sesión activa abre la 1ª pestaña; si no, muestra el login.</w:t>
+            </w:r>
+          </w:p>
+        </w:tc>
+      </w:tr>
+      <w:tr>
+        <w:tblPrEx>
+          <w:tblCellMar>
+            <w:top w:w="0" w:type="dxa"/>
+            <w:bottom w:w="0" w:type="dxa"/>
+          </w:tblCellMar>
+        </w:tblPrEx>
+        <w:tc>
+          <w:tcPr>
+            <w:tcW w:w="2900" w:type="dxa"/>
+            <w:tcMar>
+              <w:top w:w="60" w:type="dxa"/>
+              <w:left w:w="110" w:type="dxa"/>
+              <w:bottom w:w="60" w:type="dxa"/>
+              <w:right w:w="110" w:type="dxa"/>
+            </w:tcMar>
+          </w:tcPr>
+          <w:p>
+            <w:proofErr w:type="spellStart"/>
+            <w:r>
+              <w:rPr>
+                <w:rFonts w:ascii="Consolas" w:eastAsia="Consolas" w:hAnsi="Consolas" w:cs="Consolas"/>
+                <w:b/>
+                <w:bCs/>
+                <w:color w:val="8E44AD"/>
+                <w:sz w:val="18"/>
+                <w:szCs w:val="18"/>
+              </w:rPr>
+              <w:t>buildAccessibilityFab() / toggleA11yPanel() / closeA11yPanelOnOutsideClick()</w:t>
+            </w:r>
+            <w:proofErr w:type="spellEnd"/>
+            <w:r>
+              <w:rPr>
+                <w:rFonts w:ascii="Consolas" w:eastAsia="Consolas" w:hAnsi="Consolas" w:cs="Consolas"/>
+                <w:b/>
+                <w:bCs/>
+                <w:color w:val="8E44AD"/>
+                <w:sz w:val="18"/>
+                <w:szCs w:val="18"/>
+              </w:rPr>
+            </w:r>
+          </w:p>
+        </w:tc>
+        <w:tc>
+          <w:tcPr>
+            <w:tcW w:w="6460" w:type="dxa"/>
+            <w:tcMar>
+              <w:top w:w="60" w:type="dxa"/>
+              <w:left w:w="110" w:type="dxa"/>
+              <w:bottom w:w="60" w:type="dxa"/>
+              <w:right w:w="110" w:type="dxa"/>
+            </w:tcMar>
+          </w:tcPr>
+          <w:p>
+            <w:r>
+              <w:rPr>
+                <w:sz w:val="20"/>
+                <w:szCs w:val="20"/>
+              </w:rPr>
+              <w:t>Botón flotante de accesibilidad, fijo cerca del footer y visible en cualquier tamaño de pantalla: abre/cierra un panel con los controles de tamaño de letra (A-/A/A+) y de tema claro/oscuro. Se cierra al hacer clic fuera.</w:t>
+            </w:r>
+            <w:proofErr w:type="spellStart"/>
+            <w:r>
+              <w:rPr>
+                <w:sz w:val="20"/>
+                <w:szCs w:val="20"/>
+              </w:rPr>
+            </w:r>
+            <w:proofErr w:type="spellEnd"/>
+            <w:r>
+              <w:rPr>
+                <w:sz w:val="20"/>
+                <w:szCs w:val="20"/>
+              </w:rPr>
+            </w:r>
+            <w:proofErr w:type="spellStart"/>
+            <w:r>
+              <w:rPr>
+                <w:sz w:val="20"/>
+                <w:szCs w:val="20"/>
+              </w:rPr>
+            </w:r>
+            <w:proofErr w:type="spellEnd"/>
+            <w:r>
+              <w:rPr>
+                <w:sz w:val="20"/>
+                <w:szCs w:val="20"/>
+              </w:rPr>
+            </w:r>
+            <w:proofErr w:type="spellStart"/>
+            <w:r>
+              <w:rPr>
+                <w:sz w:val="20"/>
+                <w:szCs w:val="20"/>
+              </w:rPr>
+            </w:r>
+            <w:proofErr w:type="spellEnd"/>
+            <w:r>
+              <w:rPr>
+                <w:sz w:val="20"/>
+                <w:szCs w:val="20"/>
+              </w:rPr>
+            </w:r>
+            <w:proofErr w:type="spellStart"/>
+            <w:r>
+              <w:rPr>
+                <w:sz w:val="20"/>
+                <w:szCs w:val="20"/>
+              </w:rPr>
+            </w:r>
+            <w:proofErr w:type="spellEnd"/>
+            <w:r>
+              <w:rPr>
+                <w:sz w:val="20"/>
+                <w:szCs w:val="20"/>
+              </w:rPr>
+            </w:r>
+            <w:proofErr w:type="spellStart"/>
+            <w:r>
+              <w:rPr>
+                <w:sz w:val="20"/>
+                <w:szCs w:val="20"/>
+              </w:rPr>
+            </w:r>
+            <w:proofErr w:type="spellEnd"/>
+            <w:r>
+              <w:rPr>
+                <w:sz w:val="20"/>
+                <w:szCs w:val="20"/>
+              </w:rPr>
+            </w:r>
+          </w:p>
+        </w:tc>
+      </w:tr>
+      <w:tr>
+        <w:tblPrEx>
+          <w:tblCellMar>
+            <w:top w:w="0" w:type="dxa"/>
+            <w:bottom w:w="0" w:type="dxa"/>
+          </w:tblCellMar>
+        </w:tblPrEx>
+        <w:tc>
+          <w:tcPr>
+            <w:tcW w:w="2900" w:type="dxa"/>
+            <w:tcMar>
+              <w:top w:w="60" w:type="dxa"/>
+              <w:left w:w="110" w:type="dxa"/>
+              <w:bottom w:w="60" w:type="dxa"/>
+              <w:right w:w="110" w:type="dxa"/>
+            </w:tcMar>
+          </w:tcPr>
+          <w:p>
+            <w:proofErr w:type="spellStart"/>
+            <w:r>
+              <w:rPr>
+                <w:rFonts w:ascii="Consolas" w:eastAsia="Consolas" w:hAnsi="Consolas" w:cs="Consolas"/>
+                <w:b/>
+                <w:bCs/>
+                <w:color w:val="8E44AD"/>
+                <w:sz w:val="18"/>
+                <w:szCs w:val="18"/>
+              </w:rPr>
+              <w:t>buildTabs() / buildTabsBurger() / toggleTabsMenu() / closeTabsMenu()</w:t>
+            </w:r>
+            <w:proofErr w:type="spellEnd"/>
+            <w:r>
+              <w:rPr>
+                <w:rFonts w:ascii="Consolas" w:eastAsia="Consolas" w:hAnsi="Consolas" w:cs="Consolas"/>
+                <w:b/>
+                <w:bCs/>
+                <w:color w:val="8E44AD"/>
+                <w:sz w:val="18"/>
+                <w:szCs w:val="18"/>
+              </w:rPr>
+            </w:r>
+          </w:p>
+        </w:tc>
+        <w:tc>
+          <w:tcPr>
+            <w:tcW w:w="6460" w:type="dxa"/>
+            <w:tcMar>
+              <w:top w:w="60" w:type="dxa"/>
+              <w:left w:w="110" w:type="dxa"/>
+              <w:bottom w:w="60" w:type="dxa"/>
+              <w:right w:w="110" w:type="dxa"/>
+            </w:tcMar>
+          </w:tcPr>
+          <w:p>
+            <w:r>
+              <w:rPr>
+                <w:sz w:val="20"/>
+                <w:szCs w:val="20"/>
+              </w:rPr>
+              <w:t>Menú de secciones. En pantallas ≤768px las pestañas horizontales se colapsan y un botón hamburguesa despliega/oculta la lista vertical (evita la barra de scroll lateral); el menú se cierra automáticamente al elegir una sección.</w:t>
+            </w:r>
+            <w:proofErr w:type="spellStart"/>
+            <w:r>
+              <w:rPr>
+                <w:sz w:val="20"/>
+                <w:szCs w:val="20"/>
+              </w:rPr>
+            </w:r>
+            <w:proofErr w:type="spellEnd"/>
+            <w:r>
+              <w:rPr>
+                <w:sz w:val="20"/>
+                <w:szCs w:val="20"/>
+              </w:rPr>
+            </w:r>
+            <w:proofErr w:type="spellStart"/>
+            <w:r>
+              <w:rPr>
+                <w:sz w:val="20"/>
+                <w:szCs w:val="20"/>
+              </w:rPr>
+            </w:r>
+            <w:proofErr w:type="spellEnd"/>
+            <w:r>
+              <w:rPr>
+                <w:sz w:val="20"/>
+                <w:szCs w:val="20"/>
+              </w:rPr>
+            </w:r>
+            <w:proofErr w:type="spellStart"/>
+            <w:r>
+              <w:rPr>
+                <w:sz w:val="20"/>
+                <w:szCs w:val="20"/>
+              </w:rPr>
+            </w:r>
+            <w:proofErr w:type="spellEnd"/>
+            <w:r>
+              <w:rPr>
+                <w:sz w:val="20"/>
+                <w:szCs w:val="20"/>
+              </w:rPr>
+            </w:r>
+            <w:proofErr w:type="spellStart"/>
+            <w:r>
+              <w:rPr>
+                <w:sz w:val="20"/>
+                <w:szCs w:val="20"/>
+              </w:rPr>
+            </w:r>
+            <w:proofErr w:type="spellEnd"/>
+            <w:r>
+              <w:rPr>
+                <w:sz w:val="20"/>
+                <w:szCs w:val="20"/>
+              </w:rPr>
+            </w:r>
+            <w:proofErr w:type="spellStart"/>
+            <w:r>
+              <w:rPr>
+                <w:sz w:val="20"/>
+                <w:szCs w:val="20"/>
+              </w:rPr>
+            </w:r>
+            <w:proofErr w:type="spellEnd"/>
+            <w:r>
+              <w:rPr>
+                <w:sz w:val="20"/>
+                <w:szCs w:val="20"/>
+              </w:rPr>
             </w:r>
           </w:p>
         </w:tc>
@@ -14881,23 +15179,21 @@
                 <w:sz w:val="20"/>
                 <w:szCs w:val="20"/>
               </w:rPr>
-              <w:t xml:space="preserve">Carga grupos, equipos y partidos; si grupos o equipos fallan, </w:t>
-            </w:r>
-            <w:proofErr w:type="spellStart"/>
-            <w:r>
-              <w:rPr>
-                <w:sz w:val="20"/>
-                <w:szCs w:val="20"/>
-              </w:rPr>
-              <w:t>errorNotice</w:t>
-            </w:r>
-            <w:proofErr w:type="spellEnd"/>
-            <w:r>
-              <w:rPr>
-                <w:sz w:val="20"/>
-                <w:szCs w:val="20"/>
-              </w:rPr>
-              <w:t>. Detecta las rondas de eliminatoria presentes y arma los chips.</w:t>
+              <w:t>Carga grupos, equipos y partidos; si grupos o equipos fallan, errorNotice. Detecta las rondas de eliminatoria presentes y arma los chips. El contenedor usa 'columns is-multiline is-centered matriz-cols': el contenido queda centrado a ancho reducido, en dos columnas responsivas.</w:t>
+            </w:r>
+            <w:proofErr w:type="spellStart"/>
+            <w:r>
+              <w:rPr>
+                <w:sz w:val="20"/>
+                <w:szCs w:val="20"/>
+              </w:rPr>
+            </w:r>
+            <w:proofErr w:type="spellEnd"/>
+            <w:r>
+              <w:rPr>
+                <w:sz w:val="20"/>
+                <w:szCs w:val="20"/>
+              </w:rPr>
             </w:r>
           </w:p>
         </w:tc>
@@ -15236,7 +15532,7 @@
                 <w:sz w:val="20"/>
                 <w:szCs w:val="20"/>
               </w:rPr>
-              <w:t>Lista de enfrentamientos de una ronda de eliminatoria con su marcador (o "vs").</w:t>
+              <w:t>Lista de enfrentamientos de una ronda de eliminatoria con su marcador (o "vs"). Ahora se muestra en un card a media anchura (column is-half) para que octavos, cuartos, etc. fluyan en dos columnas responsivas junto a los grupos.</w:t>
             </w:r>
           </w:p>
         </w:tc>
@@ -16537,6 +16833,116 @@
                 <w:szCs w:val="20"/>
               </w:rPr>
               <w:t xml:space="preserve"> del timeline, matriz y tarjeta del dashboard).</w:t>
+            </w:r>
+          </w:p>
+        </w:tc>
+      </w:tr>
+      <w:tr>
+        <w:tblPrEx>
+          <w:tblCellMar>
+            <w:top w:w="0" w:type="dxa"/>
+            <w:bottom w:w="0" w:type="dxa"/>
+          </w:tblCellMar>
+        </w:tblPrEx>
+        <w:tc>
+          <w:tcPr>
+            <w:tcW w:w="2900" w:type="dxa"/>
+            <w:tcMar>
+              <w:top w:w="60" w:type="dxa"/>
+              <w:left w:w="110" w:type="dxa"/>
+              <w:bottom w:w="60" w:type="dxa"/>
+              <w:right w:w="110" w:type="dxa"/>
+            </w:tcMar>
+          </w:tcPr>
+          <w:p>
+            <w:r>
+              <w:rPr>
+                <w:rFonts w:ascii="Consolas" w:eastAsia="Consolas" w:hAnsi="Consolas" w:cs="Consolas"/>
+                <w:b/>
+                <w:bCs/>
+                <w:color w:val="8E44AD"/>
+                <w:sz w:val="18"/>
+                <w:szCs w:val="18"/>
+              </w:rPr>
+              <w:t>.conn-dot / .a11y-fab / .a11y-panel / .tabs-burger / .matriz-cols</w:t>
+            </w:r>
+            <w:proofErr w:type="spellStart"/>
+            <w:r>
+              <w:rPr>
+                <w:rFonts w:ascii="Consolas" w:eastAsia="Consolas" w:hAnsi="Consolas" w:cs="Consolas"/>
+                <w:b/>
+                <w:bCs/>
+                <w:color w:val="8E44AD"/>
+                <w:sz w:val="18"/>
+                <w:szCs w:val="18"/>
+              </w:rPr>
+            </w:r>
+            <w:proofErr w:type="spellEnd"/>
+            <w:r>
+              <w:rPr>
+                <w:rFonts w:ascii="Consolas" w:eastAsia="Consolas" w:hAnsi="Consolas" w:cs="Consolas"/>
+                <w:b/>
+                <w:bCs/>
+                <w:color w:val="8E44AD"/>
+                <w:sz w:val="18"/>
+                <w:szCs w:val="18"/>
+              </w:rPr>
+            </w:r>
+            <w:proofErr w:type="spellStart"/>
+            <w:r>
+              <w:rPr>
+                <w:rFonts w:ascii="Consolas" w:eastAsia="Consolas" w:hAnsi="Consolas" w:cs="Consolas"/>
+                <w:b/>
+                <w:bCs/>
+                <w:color w:val="8E44AD"/>
+                <w:sz w:val="18"/>
+                <w:szCs w:val="18"/>
+              </w:rPr>
+            </w:r>
+            <w:proofErr w:type="spellEnd"/>
+            <w:r>
+              <w:rPr>
+                <w:rFonts w:ascii="Consolas" w:eastAsia="Consolas" w:hAnsi="Consolas" w:cs="Consolas"/>
+                <w:b/>
+                <w:bCs/>
+                <w:color w:val="8E44AD"/>
+                <w:sz w:val="18"/>
+                <w:szCs w:val="18"/>
+              </w:rPr>
+            </w:r>
+          </w:p>
+        </w:tc>
+        <w:tc>
+          <w:tcPr>
+            <w:tcW w:w="6460" w:type="dxa"/>
+            <w:tcMar>
+              <w:top w:w="60" w:type="dxa"/>
+              <w:left w:w="110" w:type="dxa"/>
+              <w:bottom w:w="60" w:type="dxa"/>
+              <w:right w:w="110" w:type="dxa"/>
+            </w:tcMar>
+          </w:tcPr>
+          <w:p>
+            <w:r>
+              <w:rPr>
+                <w:sz w:val="20"/>
+                <w:szCs w:val="20"/>
+              </w:rPr>
+              <w:t>Responsive y accesibilidad: punto de conexión verde/rojo, botón flotante de accesibilidad y su panel emergente, menú hamburguesa de pestañas (≤768px, oculta las pestañas y centra el contenido interno de las matrices) y rejilla de la matriz centrada a ancho reducido con dos columnas.</w:t>
+            </w:r>
+            <w:proofErr w:type="spellStart"/>
+            <w:r>
+              <w:rPr>
+                <w:sz w:val="20"/>
+                <w:szCs w:val="20"/>
+              </w:rPr>
+            </w:r>
+            <w:proofErr w:type="spellEnd"/>
+            <w:r>
+              <w:rPr>
+                <w:sz w:val="20"/>
+                <w:szCs w:val="20"/>
+              </w:rPr>
             </w:r>
           </w:p>
         </w:tc>

</xml_diff>

<commit_message>
fix(ui): connection dot reflects real API network failures, not just navigator.onLine
</commit_message>
<xml_diff>
--- a/Documentacion_Tecnica_ProyectoFinal_ISW521.docx
+++ b/Documentacion_Tecnica_ProyectoFinal_ISW521.docx
@@ -3412,6 +3412,119 @@
       </w:tr>
     </w:tbl>
     <w:p>
+      <w:r>
+        <w:rPr>
+          <w:b/>
+        </w:rPr>
+        <w:t>Posibles preguntas (defensa):</w:t>
+      </w:r>
+    </w:p>
+    <w:tbl>
+      <w:tblPr>
+        <w:tblW w:type="auto" w:w="0"/>
+        <w:tblLayout w:type="autofit"/>
+        <w:tblLook w:firstColumn="1" w:firstRow="1" w:lastColumn="0" w:lastRow="0" w:noHBand="0" w:noVBand="1" w:val="04A0"/>
+      </w:tblPr>
+      <w:tblGrid>
+        <w:gridCol w:w="4680"/>
+        <w:gridCol w:w="4680"/>
+      </w:tblGrid>
+      <w:tr>
+        <w:tc>
+          <w:tcPr>
+            <w:tcW w:type="dxa" w:w="3090"/>
+          </w:tcPr>
+          <w:p>
+            <w:r>
+              <w:rPr>
+                <w:b/>
+              </w:rPr>
+              <w:t>Pregunta</w:t>
+            </w:r>
+          </w:p>
+        </w:tc>
+        <w:tc>
+          <w:tcPr>
+            <w:tcW w:type="dxa" w:w="6270"/>
+          </w:tcPr>
+          <w:p>
+            <w:r>
+              <w:rPr>
+                <w:b/>
+              </w:rPr>
+              <w:t>Respuesta</w:t>
+            </w:r>
+          </w:p>
+        </w:tc>
+      </w:tr>
+      <w:tr>
+        <w:tc>
+          <w:tcPr>
+            <w:tcW w:type="dxa" w:w="3090"/>
+          </w:tcPr>
+          <w:p>
+            <w:r>
+              <w:t>¿Por qué toda la persistencia (token, caché, preferencias) vive en un solo módulo?</w:t>
+            </w:r>
+          </w:p>
+        </w:tc>
+        <w:tc>
+          <w:tcPr>
+            <w:tcW w:type="dxa" w:w="6270"/>
+          </w:tcPr>
+          <w:p>
+            <w:r>
+              <w:t>Para centralizar el acceso a localStorage y que los demás módulos no dependan del navegador directamente; respeta la separación de responsabilidades y facilita cambiar el almacenamiento.</w:t>
+            </w:r>
+          </w:p>
+        </w:tc>
+      </w:tr>
+      <w:tr>
+        <w:tc>
+          <w:tcPr>
+            <w:tcW w:type="dxa" w:w="3090"/>
+          </w:tcPr>
+          <w:p>
+            <w:r>
+              <w:t>¿Cómo evita colisiones de claves en localStorage?</w:t>
+            </w:r>
+          </w:p>
+        </w:tc>
+        <w:tc>
+          <w:tcPr>
+            <w:tcW w:type="dxa" w:w="6270"/>
+          </w:tcPr>
+          <w:p>
+            <w:r>
+              <w:t>Usa prefijos: TOKEN_KEY="wc_token", CACHE_PREFIX="wc_cache:" y PREF_PREFIX="wc_pref:", así cada tipo de dato queda con su propio espacio de nombres.</w:t>
+            </w:r>
+          </w:p>
+        </w:tc>
+      </w:tr>
+      <w:tr>
+        <w:tc>
+          <w:tcPr>
+            <w:tcW w:type="dxa" w:w="3090"/>
+          </w:tcPr>
+          <w:p>
+            <w:r>
+              <w:t>¿Qué guarda la caché y para qué sirve?</w:t>
+            </w:r>
+          </w:p>
+        </w:tc>
+        <w:tc>
+          <w:tcPr>
+            <w:tcW w:type="dxa" w:w="6270"/>
+          </w:tcPr>
+          <w:p>
+            <w:r>
+              <w:t>La última respuesta exitosa de cada endpoint con su timestamp; habilita el "modo offline": si una petición falla se muestra el dato cacheado marcado como stale.</w:t>
+            </w:r>
+          </w:p>
+        </w:tc>
+      </w:tr>
+    </w:tbl>
+    <w:p>
       <w:pPr>
         <w:pStyle w:val="Ttulo2"/>
         <w:spacing w:before="220" w:after="90"/>
@@ -5141,6 +5254,119 @@
       </w:tr>
     </w:tbl>
     <w:p>
+      <w:r>
+        <w:rPr>
+          <w:b/>
+        </w:rPr>
+        <w:t>Posibles preguntas (defensa):</w:t>
+      </w:r>
+    </w:p>
+    <w:tbl>
+      <w:tblPr>
+        <w:tblW w:type="auto" w:w="0"/>
+        <w:tblLayout w:type="autofit"/>
+        <w:tblLook w:firstColumn="1" w:firstRow="1" w:lastColumn="0" w:lastRow="0" w:noHBand="0" w:noVBand="1" w:val="04A0"/>
+      </w:tblPr>
+      <w:tblGrid>
+        <w:gridCol w:w="4680"/>
+        <w:gridCol w:w="4680"/>
+      </w:tblGrid>
+      <w:tr>
+        <w:tc>
+          <w:tcPr>
+            <w:tcW w:type="dxa" w:w="3090"/>
+          </w:tcPr>
+          <w:p>
+            <w:r>
+              <w:rPr>
+                <w:b/>
+              </w:rPr>
+              <w:t>Pregunta</w:t>
+            </w:r>
+          </w:p>
+        </w:tc>
+        <w:tc>
+          <w:tcPr>
+            <w:tcW w:type="dxa" w:w="6270"/>
+          </w:tcPr>
+          <w:p>
+            <w:r>
+              <w:rPr>
+                <w:b/>
+              </w:rPr>
+              <w:t>Respuesta</w:t>
+            </w:r>
+          </w:p>
+        </w:tc>
+      </w:tr>
+      <w:tr>
+        <w:tc>
+          <w:tcPr>
+            <w:tcW w:type="dxa" w:w="3090"/>
+          </w:tcPr>
+          <w:p>
+            <w:r>
+              <w:t>¿Cómo obtienes el color dominante de la bandera?</w:t>
+            </w:r>
+          </w:p>
+        </w:tc>
+        <w:tc>
+          <w:tcPr>
+            <w:tcW w:type="dxa" w:w="6270"/>
+          </w:tcPr>
+          <w:p>
+            <w:r>
+              <w:t>Cargo la imagen en un &lt;canvas&gt;, leo los píxeles con getImageData y cuantizo/promedio el color; de ahí derivo acento, tinte y color interior según el tema.</w:t>
+            </w:r>
+          </w:p>
+        </w:tc>
+      </w:tr>
+      <w:tr>
+        <w:tc>
+          <w:tcPr>
+            <w:tcW w:type="dxa" w:w="3090"/>
+          </w:tcPr>
+          <w:p>
+            <w:r>
+              <w:t>¿Qué problema puede haber al leer el canvas y cómo lo manejas?</w:t>
+            </w:r>
+          </w:p>
+        </w:tc>
+        <w:tc>
+          <w:tcPr>
+            <w:tcW w:type="dxa" w:w="6270"/>
+          </w:tcPr>
+          <w:p>
+            <w:r>
+              <w:t>Si la imagen es de otro origen sin crossOrigin el canvas queda "tainted" y getImageData falla; por eso existe un color de respaldo (fallbackHex) cuando la extracción no es posible.</w:t>
+            </w:r>
+          </w:p>
+        </w:tc>
+      </w:tr>
+      <w:tr>
+        <w:tc>
+          <w:tcPr>
+            <w:tcW w:type="dxa" w:w="3090"/>
+          </w:tcPr>
+          <w:p>
+            <w:r>
+              <w:t>¿Por qué exponer applyFavTextColor por separado?</w:t>
+            </w:r>
+          </w:p>
+        </w:tc>
+        <w:tc>
+          <w:tcPr>
+            <w:tcW w:type="dxa" w:w="6270"/>
+          </w:tcPr>
+          <w:p>
+            <w:r>
+              <w:t>Para que app.js pueda re-aplicar el color del texto favorito al cambiar de tema sin volver a extraer la bandera.</w:t>
+            </w:r>
+          </w:p>
+        </w:tc>
+      </w:tr>
+    </w:tbl>
+    <w:p>
       <w:pPr>
         <w:pStyle w:val="Ttulo2"/>
         <w:spacing w:before="220" w:after="90"/>
@@ -6433,6 +6659,141 @@
       </w:tr>
     </w:tbl>
     <w:p>
+      <w:r>
+        <w:rPr>
+          <w:b/>
+        </w:rPr>
+        <w:t>Posibles preguntas (defensa):</w:t>
+      </w:r>
+    </w:p>
+    <w:tbl>
+      <w:tblPr>
+        <w:tblW w:type="auto" w:w="0"/>
+        <w:tblLayout w:type="autofit"/>
+        <w:tblLook w:firstColumn="1" w:firstRow="1" w:lastColumn="0" w:lastRow="0" w:noHBand="0" w:noVBand="1" w:val="04A0"/>
+      </w:tblPr>
+      <w:tblGrid>
+        <w:gridCol w:w="4680"/>
+        <w:gridCol w:w="4680"/>
+      </w:tblGrid>
+      <w:tr>
+        <w:tc>
+          <w:tcPr>
+            <w:tcW w:type="dxa" w:w="3090"/>
+          </w:tcPr>
+          <w:p>
+            <w:r>
+              <w:rPr>
+                <w:b/>
+              </w:rPr>
+              <w:t>Pregunta</w:t>
+            </w:r>
+          </w:p>
+        </w:tc>
+        <w:tc>
+          <w:tcPr>
+            <w:tcW w:type="dxa" w:w="6270"/>
+          </w:tcPr>
+          <w:p>
+            <w:r>
+              <w:rPr>
+                <w:b/>
+              </w:rPr>
+              <w:t>Respuesta</w:t>
+            </w:r>
+          </w:p>
+        </w:tc>
+      </w:tr>
+      <w:tr>
+        <w:tc>
+          <w:tcPr>
+            <w:tcW w:type="dxa" w:w="3090"/>
+          </w:tcPr>
+          <w:p>
+            <w:r>
+              <w:t>¿Cómo implementas el reintento con backoff exponencial?</w:t>
+            </w:r>
+          </w:p>
+        </w:tc>
+        <w:tc>
+          <w:tcPr>
+            <w:tcW w:type="dxa" w:w="6270"/>
+          </w:tcPr>
+          <w:p>
+            <w:r>
+              <w:t>Con BASE_DELAYS=[1000,2000,4000,8000]: ante 429/500/502/503/504 se reintenta esperando ese tiempo con cuenta regresiva visible; tras agotar los 4 intentos emite GIVEUP.</w:t>
+            </w:r>
+          </w:p>
+        </w:tc>
+      </w:tr>
+      <w:tr>
+        <w:tc>
+          <w:tcPr>
+            <w:tcW w:type="dxa" w:w="3090"/>
+          </w:tcPr>
+          <w:p>
+            <w:r>
+              <w:t>¿Por qué api.js no toca el DOM?</w:t>
+            </w:r>
+          </w:p>
+        </w:tc>
+        <w:tc>
+          <w:tcPr>
+            <w:tcW w:type="dxa" w:w="6270"/>
+          </w:tcPr>
+          <w:p>
+            <w:r>
+              <w:t>Para separar red/resiliencia de presentación: api.js sólo emite eventos en window y ui.js los pinta. Así la lógica queda desacoplada y testeable (lo evalúa la rúbrica).</w:t>
+            </w:r>
+          </w:p>
+        </w:tc>
+      </w:tr>
+      <w:tr>
+        <w:tc>
+          <w:tcPr>
+            <w:tcW w:type="dxa" w:w="3090"/>
+          </w:tcPr>
+          <w:p>
+            <w:r>
+              <w:t>¿Qué ocurre ante un 401?</w:t>
+            </w:r>
+          </w:p>
+        </w:tc>
+        <w:tc>
+          <w:tcPr>
+            <w:tcW w:type="dxa" w:w="6270"/>
+          </w:tcPr>
+          <w:p>
+            <w:r>
+              <w:t>handleUnauthorized limpia el token, emite SESSION_EXPIRED y lanza HttpError; nunca recarga la página: el modal de sesión expirada aparece sin perder el estado.</w:t>
+            </w:r>
+          </w:p>
+        </w:tc>
+      </w:tr>
+      <w:tr>
+        <w:tc>
+          <w:tcPr>
+            <w:tcW w:type="dxa" w:w="3090"/>
+          </w:tcPr>
+          <w:p>
+            <w:r>
+              <w:t>¿Cómo se cumple el uso de async/await?</w:t>
+            </w:r>
+          </w:p>
+        </w:tc>
+        <w:tc>
+          <w:tcPr>
+            <w:tcW w:type="dxa" w:w="6270"/>
+          </w:tcPr>
+          <w:p>
+            <w:r>
+              <w:t>request() es un bucle while con await de fetch y de las esperas; no se encadenan promesas con .then, cumpliendo el requisito obligatorio.</w:t>
+            </w:r>
+          </w:p>
+        </w:tc>
+      </w:tr>
+    </w:tbl>
+    <w:p>
       <w:pPr>
         <w:pStyle w:val="Ttulo2"/>
         <w:spacing w:before="220" w:after="90"/>
@@ -7370,6 +7731,97 @@
                 <w:szCs w:val="20"/>
               </w:rPr>
               <w:t>Devuelve true si hay un token guardado.</w:t>
+            </w:r>
+          </w:p>
+        </w:tc>
+      </w:tr>
+    </w:tbl>
+    <w:p>
+      <w:r>
+        <w:rPr>
+          <w:b/>
+        </w:rPr>
+        <w:t>Posibles preguntas (defensa):</w:t>
+      </w:r>
+    </w:p>
+    <w:tbl>
+      <w:tblPr>
+        <w:tblW w:type="auto" w:w="0"/>
+        <w:tblLayout w:type="autofit"/>
+        <w:tblLook w:firstColumn="1" w:firstRow="1" w:lastColumn="0" w:lastRow="0" w:noHBand="0" w:noVBand="1" w:val="04A0"/>
+      </w:tblPr>
+      <w:tblGrid>
+        <w:gridCol w:w="4680"/>
+        <w:gridCol w:w="4680"/>
+      </w:tblGrid>
+      <w:tr>
+        <w:tc>
+          <w:tcPr>
+            <w:tcW w:type="dxa" w:w="3090"/>
+          </w:tcPr>
+          <w:p>
+            <w:r>
+              <w:rPr>
+                <w:b/>
+              </w:rPr>
+              <w:t>Pregunta</w:t>
+            </w:r>
+          </w:p>
+        </w:tc>
+        <w:tc>
+          <w:tcPr>
+            <w:tcW w:type="dxa" w:w="6270"/>
+          </w:tcPr>
+          <w:p>
+            <w:r>
+              <w:rPr>
+                <w:b/>
+              </w:rPr>
+              <w:t>Respuesta</w:t>
+            </w:r>
+          </w:p>
+        </w:tc>
+      </w:tr>
+      <w:tr>
+        <w:tc>
+          <w:tcPr>
+            <w:tcW w:type="dxa" w:w="3090"/>
+          </w:tcPr>
+          <w:p>
+            <w:r>
+              <w:t>¿Por qué auth.js no usa el request() de api.js?</w:t>
+            </w:r>
+          </w:p>
+        </w:tc>
+        <w:tc>
+          <w:tcPr>
+            <w:tcW w:type="dxa" w:w="6270"/>
+          </w:tcPr>
+          <w:p>
+            <w:r>
+              <w:t>Porque las rutas /auth/* son públicas y no llevan token; auth hace su propio fetch y, al obtener el JWT, lo guarda con store.setToken.</w:t>
+            </w:r>
+          </w:p>
+        </w:tc>
+      </w:tr>
+      <w:tr>
+        <w:tc>
+          <w:tcPr>
+            <w:tcW w:type="dxa" w:w="3090"/>
+          </w:tcPr>
+          <w:p>
+            <w:r>
+              <w:t>¿Dónde se guarda el token y cómo se cierra sesión?</w:t>
+            </w:r>
+          </w:p>
+        </w:tc>
+        <w:tc>
+          <w:tcPr>
+            <w:tcW w:type="dxa" w:w="6270"/>
+          </w:tcPr>
+          <w:p>
+            <w:r>
+              <w:t>En localStorage vía store; logout() llama a store.clearToken() e isLoggedIn() comprueba si hay token.</w:t>
             </w:r>
           </w:p>
         </w:tc>
@@ -9317,6 +9769,119 @@
       </w:tr>
     </w:tbl>
     <w:p>
+      <w:r>
+        <w:rPr>
+          <w:b/>
+        </w:rPr>
+        <w:t>Posibles preguntas (defensa):</w:t>
+      </w:r>
+    </w:p>
+    <w:tbl>
+      <w:tblPr>
+        <w:tblW w:type="auto" w:w="0"/>
+        <w:tblLayout w:type="autofit"/>
+        <w:tblLook w:firstColumn="1" w:firstRow="1" w:lastColumn="0" w:lastRow="0" w:noHBand="0" w:noVBand="1" w:val="04A0"/>
+      </w:tblPr>
+      <w:tblGrid>
+        <w:gridCol w:w="4680"/>
+        <w:gridCol w:w="4680"/>
+      </w:tblGrid>
+      <w:tr>
+        <w:tc>
+          <w:tcPr>
+            <w:tcW w:type="dxa" w:w="3090"/>
+          </w:tcPr>
+          <w:p>
+            <w:r>
+              <w:rPr>
+                <w:b/>
+              </w:rPr>
+              <w:t>Pregunta</w:t>
+            </w:r>
+          </w:p>
+        </w:tc>
+        <w:tc>
+          <w:tcPr>
+            <w:tcW w:type="dxa" w:w="6270"/>
+          </w:tcPr>
+          <w:p>
+            <w:r>
+              <w:rPr>
+                <w:b/>
+              </w:rPr>
+              <w:t>Respuesta</w:t>
+            </w:r>
+          </w:p>
+        </w:tc>
+      </w:tr>
+      <w:tr>
+        <w:tc>
+          <w:tcPr>
+            <w:tcW w:type="dxa" w:w="3090"/>
+          </w:tcPr>
+          <w:p>
+            <w:r>
+              <w:t>¿Qué es el helper el() y por qué es central?</w:t>
+            </w:r>
+          </w:p>
+        </w:tc>
+        <w:tc>
+          <w:tcPr>
+            <w:tcW w:type="dxa" w:w="6270"/>
+          </w:tcPr>
+          <w:p>
+            <w:r>
+              <w:t>Una fábrica de nodos DOM que interpreta props especiales (class, text, html, dataset); evita innerHTML manual y unifica la creación de UI en todas las vistas.</w:t>
+            </w:r>
+          </w:p>
+        </w:tc>
+      </w:tr>
+      <w:tr>
+        <w:tc>
+          <w:tcPr>
+            <w:tcW w:type="dxa" w:w="3090"/>
+          </w:tcPr>
+          <w:p>
+            <w:r>
+              <w:t>¿Cómo conecta ui.js con la resiliencia de api.js?</w:t>
+            </w:r>
+          </w:p>
+        </w:tc>
+        <w:tc>
+          <w:tcPr>
+            <w:tcW w:type="dxa" w:w="6270"/>
+          </w:tcPr>
+          <w:p>
+            <w:r>
+              <w:t>wireBannerToApi() escucha los eventos RETRY/COUNTDOWN/SUCCESS/GIVEUP y muestra el banner inferior con la cuenta regresiva; api.js no sabe nada del DOM.</w:t>
+            </w:r>
+          </w:p>
+        </w:tc>
+      </w:tr>
+      <w:tr>
+        <w:tc>
+          <w:tcPr>
+            <w:tcW w:type="dxa" w:w="3090"/>
+          </w:tcPr>
+          <w:p>
+            <w:r>
+              <w:t>¿Cómo funciona el punto verde/rojo de conexión?</w:t>
+            </w:r>
+          </w:p>
+        </w:tc>
+        <w:tc>
+          <w:tcPr>
+            <w:tcW w:type="dxa" w:w="6270"/>
+          </w:tcPr>
+          <w:p>
+            <w:r>
+              <w:t>connectionDot() crea un punto que refleja navigator.onLine y se actualiza con los eventos window online/offline; queda siempre visible junto a Salir.</w:t>
+            </w:r>
+          </w:p>
+        </w:tc>
+      </w:tr>
+    </w:tbl>
+    <w:p>
       <w:pPr>
         <w:pStyle w:val="Ttulo2"/>
         <w:spacing w:before="220" w:after="90"/>
@@ -10861,6 +11426,141 @@
       </w:tr>
     </w:tbl>
     <w:p>
+      <w:r>
+        <w:rPr>
+          <w:b/>
+        </w:rPr>
+        <w:t>Posibles preguntas (defensa):</w:t>
+      </w:r>
+    </w:p>
+    <w:tbl>
+      <w:tblPr>
+        <w:tblW w:type="auto" w:w="0"/>
+        <w:tblLayout w:type="autofit"/>
+        <w:tblLook w:firstColumn="1" w:firstRow="1" w:lastColumn="0" w:lastRow="0" w:noHBand="0" w:noVBand="1" w:val="04A0"/>
+      </w:tblPr>
+      <w:tblGrid>
+        <w:gridCol w:w="4680"/>
+        <w:gridCol w:w="4680"/>
+      </w:tblGrid>
+      <w:tr>
+        <w:tc>
+          <w:tcPr>
+            <w:tcW w:type="dxa" w:w="3090"/>
+          </w:tcPr>
+          <w:p>
+            <w:r>
+              <w:rPr>
+                <w:b/>
+              </w:rPr>
+              <w:t>Pregunta</w:t>
+            </w:r>
+          </w:p>
+        </w:tc>
+        <w:tc>
+          <w:tcPr>
+            <w:tcW w:type="dxa" w:w="6270"/>
+          </w:tcPr>
+          <w:p>
+            <w:r>
+              <w:rPr>
+                <w:b/>
+              </w:rPr>
+              <w:t>Respuesta</w:t>
+            </w:r>
+          </w:p>
+        </w:tc>
+      </w:tr>
+      <w:tr>
+        <w:tc>
+          <w:tcPr>
+            <w:tcW w:type="dxa" w:w="3090"/>
+          </w:tcPr>
+          <w:p>
+            <w:r>
+              <w:t>¿Cómo funciona el router de pestañas sin recargar la página?</w:t>
+            </w:r>
+          </w:p>
+        </w:tc>
+        <w:tc>
+          <w:tcPr>
+            <w:tcW w:type="dxa" w:w="6270"/>
+          </w:tcPr>
+          <w:p>
+            <w:r>
+              <w:t>activate(tab) marca la pestaña activa, limpia viewRoot y hace await del mount() de la vista; es una SPA, no hay navegación de página.</w:t>
+            </w:r>
+          </w:p>
+        </w:tc>
+      </w:tr>
+      <w:tr>
+        <w:tc>
+          <w:tcPr>
+            <w:tcW w:type="dxa" w:w="3090"/>
+          </w:tcPr>
+          <w:p>
+            <w:r>
+              <w:t>¿Por qué moviste los controles de accesibilidad a un botón flotante?</w:t>
+            </w:r>
+          </w:p>
+        </w:tc>
+        <w:tc>
+          <w:tcPr>
+            <w:tcW w:type="dxa" w:w="6270"/>
+          </w:tcPr>
+          <w:p>
+            <w:r>
+              <w:t>En pantallas pequeñas los botones de letra/tema se encimaban sobre el título; el botón flotante los mantiene accesibles en cualquier tamaño y deja el header limpio (sólo Salir + estado de conexión).</w:t>
+            </w:r>
+          </w:p>
+        </w:tc>
+      </w:tr>
+      <w:tr>
+        <w:tc>
+          <w:tcPr>
+            <w:tcW w:type="dxa" w:w="3090"/>
+          </w:tcPr>
+          <w:p>
+            <w:r>
+              <w:t>¿Cómo resolviste el desbordamiento del menú en móvil?</w:t>
+            </w:r>
+          </w:p>
+        </w:tc>
+        <w:tc>
+          <w:tcPr>
+            <w:tcW w:type="dxa" w:w="6270"/>
+          </w:tcPr>
+          <w:p>
+            <w:r>
+              <w:t>A ≤768px las pestañas se ocultan y aparece un menú hamburguesa que despliega la lista vertical; se cierra al elegir sección, evitando la barra de scroll lateral.</w:t>
+            </w:r>
+          </w:p>
+        </w:tc>
+      </w:tr>
+      <w:tr>
+        <w:tc>
+          <w:tcPr>
+            <w:tcW w:type="dxa" w:w="3090"/>
+          </w:tcPr>
+          <w:p>
+            <w:r>
+              <w:t>¿Cómo se persiste el tema y el tamaño de letra?</w:t>
+            </w:r>
+          </w:p>
+        </w:tc>
+        <w:tc>
+          <w:tcPr>
+            <w:tcW w:type="dxa" w:w="6270"/>
+          </w:tcPr>
+          <w:p>
+            <w:r>
+              <w:t>Con store.setPref/getPref (localStorage); al arrancar, start() re-aplica el tema y la escala guardados.</w:t>
+            </w:r>
+          </w:p>
+        </w:tc>
+      </w:tr>
+    </w:tbl>
+    <w:p>
       <w:pPr>
         <w:spacing w:after="40"/>
       </w:pPr>
@@ -11783,6 +12483,97 @@
       </w:tr>
     </w:tbl>
     <w:p>
+      <w:r>
+        <w:rPr>
+          <w:b/>
+        </w:rPr>
+        <w:t>Posibles preguntas (defensa):</w:t>
+      </w:r>
+    </w:p>
+    <w:tbl>
+      <w:tblPr>
+        <w:tblW w:type="auto" w:w="0"/>
+        <w:tblLayout w:type="autofit"/>
+        <w:tblLook w:firstColumn="1" w:firstRow="1" w:lastColumn="0" w:lastRow="0" w:noHBand="0" w:noVBand="1" w:val="04A0"/>
+      </w:tblPr>
+      <w:tblGrid>
+        <w:gridCol w:w="4680"/>
+        <w:gridCol w:w="4680"/>
+      </w:tblGrid>
+      <w:tr>
+        <w:tc>
+          <w:tcPr>
+            <w:tcW w:type="dxa" w:w="3090"/>
+          </w:tcPr>
+          <w:p>
+            <w:r>
+              <w:rPr>
+                <w:b/>
+              </w:rPr>
+              <w:t>Pregunta</w:t>
+            </w:r>
+          </w:p>
+        </w:tc>
+        <w:tc>
+          <w:tcPr>
+            <w:tcW w:type="dxa" w:w="6270"/>
+          </w:tcPr>
+          <w:p>
+            <w:r>
+              <w:rPr>
+                <w:b/>
+              </w:rPr>
+              <w:t>Respuesta</w:t>
+            </w:r>
+          </w:p>
+        </w:tc>
+      </w:tr>
+      <w:tr>
+        <w:tc>
+          <w:tcPr>
+            <w:tcW w:type="dxa" w:w="3090"/>
+          </w:tcPr>
+          <w:p>
+            <w:r>
+              <w:t>¿Qué es el scroll programático dentro de un contenedor propio?</w:t>
+            </w:r>
+          </w:p>
+        </w:tc>
+        <w:tc>
+          <w:tcPr>
+            <w:tcW w:type="dxa" w:w="6270"/>
+          </w:tcPr>
+          <w:p>
+            <w:r>
+              <w:t>El recorrido por las 16 sedes hace scroll dentro de su propio contenedor (no de la página) con scrollIntoView, y resalta la sede activa.</w:t>
+            </w:r>
+          </w:p>
+        </w:tc>
+      </w:tr>
+      <w:tr>
+        <w:tc>
+          <w:tcPr>
+            <w:tcW w:type="dxa" w:w="3090"/>
+          </w:tcPr>
+          <w:p>
+            <w:r>
+              <w:t>¿Cómo sabes qué sede está activa al desplazarte?</w:t>
+            </w:r>
+          </w:p>
+        </w:tc>
+        <w:tc>
+          <w:tcPr>
+            <w:tcW w:type="dxa" w:w="6270"/>
+          </w:tcPr>
+          <w:p>
+            <w:r>
+              <w:t>Con un cálculo/observador de posición que marca la sección visible con la clase is-active.</w:t>
+            </w:r>
+          </w:p>
+        </w:tc>
+      </w:tr>
+    </w:tbl>
+    <w:p>
       <w:pPr>
         <w:pStyle w:val="Ttulo2"/>
         <w:spacing w:before="220" w:after="90"/>
@@ -12634,6 +13425,97 @@
       </w:tr>
     </w:tbl>
     <w:p>
+      <w:r>
+        <w:rPr>
+          <w:b/>
+        </w:rPr>
+        <w:t>Posibles preguntas (defensa):</w:t>
+      </w:r>
+    </w:p>
+    <w:tbl>
+      <w:tblPr>
+        <w:tblW w:type="auto" w:w="0"/>
+        <w:tblLayout w:type="autofit"/>
+        <w:tblLook w:firstColumn="1" w:firstRow="1" w:lastColumn="0" w:lastRow="0" w:noHBand="0" w:noVBand="1" w:val="04A0"/>
+      </w:tblPr>
+      <w:tblGrid>
+        <w:gridCol w:w="4680"/>
+        <w:gridCol w:w="4680"/>
+      </w:tblGrid>
+      <w:tr>
+        <w:tc>
+          <w:tcPr>
+            <w:tcW w:type="dxa" w:w="3090"/>
+          </w:tcPr>
+          <w:p>
+            <w:r>
+              <w:rPr>
+                <w:b/>
+              </w:rPr>
+              <w:t>Pregunta</w:t>
+            </w:r>
+          </w:p>
+        </w:tc>
+        <w:tc>
+          <w:tcPr>
+            <w:tcW w:type="dxa" w:w="6270"/>
+          </w:tcPr>
+          <w:p>
+            <w:r>
+              <w:rPr>
+                <w:b/>
+              </w:rPr>
+              <w:t>Respuesta</w:t>
+            </w:r>
+          </w:p>
+        </w:tc>
+      </w:tr>
+      <w:tr>
+        <w:tc>
+          <w:tcPr>
+            <w:tcW w:type="dxa" w:w="3090"/>
+          </w:tcPr>
+          <w:p>
+            <w:r>
+              <w:t>¿Cómo detectas días con partidos simultáneos?</w:t>
+            </w:r>
+          </w:p>
+        </w:tc>
+        <w:tc>
+          <w:tcPr>
+            <w:tcW w:type="dxa" w:w="6270"/>
+          </w:tcPr>
+          <w:p>
+            <w:r>
+              <w:t>Agrupo los partidos por fecha y marco los días con 2+ encuentros; el calendario resalta esos días y al elegir uno se listan sus partidos.</w:t>
+            </w:r>
+          </w:p>
+        </w:tc>
+      </w:tr>
+      <w:tr>
+        <w:tc>
+          <w:tcPr>
+            <w:tcW w:type="dxa" w:w="3090"/>
+          </w:tcPr>
+          <w:p>
+            <w:r>
+              <w:t>¿Por qué un layout de dos columnas?</w:t>
+            </w:r>
+          </w:p>
+        </w:tc>
+        <w:tc>
+          <w:tcPr>
+            <w:tcW w:type="dxa" w:w="6270"/>
+          </w:tcPr>
+          <w:p>
+            <w:r>
+              <w:t>Calendario a la izquierda y detalle del día a la derecha; en móvil colapsa a una sola columna (responsive).</w:t>
+            </w:r>
+          </w:p>
+        </w:tc>
+      </w:tr>
+    </w:tbl>
+    <w:p>
       <w:pPr>
         <w:pStyle w:val="Ttulo2"/>
         <w:spacing w:before="220" w:after="90"/>
@@ -13633,6 +14515,97 @@
       </w:tr>
     </w:tbl>
     <w:p>
+      <w:r>
+        <w:rPr>
+          <w:b/>
+        </w:rPr>
+        <w:t>Posibles preguntas (defensa):</w:t>
+      </w:r>
+    </w:p>
+    <w:tbl>
+      <w:tblPr>
+        <w:tblW w:type="auto" w:w="0"/>
+        <w:tblLayout w:type="autofit"/>
+        <w:tblLook w:firstColumn="1" w:firstRow="1" w:lastColumn="0" w:lastRow="0" w:noHBand="0" w:noVBand="1" w:val="04A0"/>
+      </w:tblPr>
+      <w:tblGrid>
+        <w:gridCol w:w="4680"/>
+        <w:gridCol w:w="4680"/>
+      </w:tblGrid>
+      <w:tr>
+        <w:tc>
+          <w:tcPr>
+            <w:tcW w:type="dxa" w:w="3090"/>
+          </w:tcPr>
+          <w:p>
+            <w:r>
+              <w:rPr>
+                <w:b/>
+              </w:rPr>
+              <w:t>Pregunta</w:t>
+            </w:r>
+          </w:p>
+        </w:tc>
+        <w:tc>
+          <w:tcPr>
+            <w:tcW w:type="dxa" w:w="6270"/>
+          </w:tcPr>
+          <w:p>
+            <w:r>
+              <w:rPr>
+                <w:b/>
+              </w:rPr>
+              <w:t>Respuesta</w:t>
+            </w:r>
+          </w:p>
+        </w:tc>
+      </w:tr>
+      <w:tr>
+        <w:tc>
+          <w:tcPr>
+            <w:tcW w:type="dxa" w:w="3090"/>
+          </w:tcPr>
+          <w:p>
+            <w:r>
+              <w:t>¿Cómo implementas el scroll infinito?</w:t>
+            </w:r>
+          </w:p>
+        </w:tc>
+        <w:tc>
+          <w:tcPr>
+            <w:tcW w:type="dxa" w:w="6270"/>
+          </w:tcPr>
+          <w:p>
+            <w:r>
+              <w:t>Pido los partidos en una sola llamada y voy insertando bloques de BLOCK=10 conforme el usuario llega al final (un sentinel/IntersectionObserver dispara el siguiente bloque).</w:t>
+            </w:r>
+          </w:p>
+        </w:tc>
+      </w:tr>
+      <w:tr>
+        <w:tc>
+          <w:tcPr>
+            <w:tcW w:type="dxa" w:w="3090"/>
+          </w:tcPr>
+          <w:p>
+            <w:r>
+              <w:t>¿Por qué cargar todo de una vez y no paginar en red?</w:t>
+            </w:r>
+          </w:p>
+        </w:tc>
+        <w:tc>
+          <w:tcPr>
+            <w:tcW w:type="dxa" w:w="6270"/>
+          </w:tcPr>
+          <w:p>
+            <w:r>
+              <w:t>El endpoint devuelve el set completo; el "infinito" es de render, para no pintar cientos de nodos de golpe y mantener la fluidez.</w:t>
+            </w:r>
+          </w:p>
+        </w:tc>
+      </w:tr>
+    </w:tbl>
+    <w:p>
       <w:pPr>
         <w:pStyle w:val="Ttulo2"/>
         <w:spacing w:before="220" w:after="90"/>
@@ -14800,6 +15773,119 @@
       </w:tr>
     </w:tbl>
     <w:p>
+      <w:r>
+        <w:rPr>
+          <w:b/>
+        </w:rPr>
+        <w:t>Posibles preguntas (defensa):</w:t>
+      </w:r>
+    </w:p>
+    <w:tbl>
+      <w:tblPr>
+        <w:tblW w:type="auto" w:w="0"/>
+        <w:tblLayout w:type="autofit"/>
+        <w:tblLook w:firstColumn="1" w:firstRow="1" w:lastColumn="0" w:lastRow="0" w:noHBand="0" w:noVBand="1" w:val="04A0"/>
+      </w:tblPr>
+      <w:tblGrid>
+        <w:gridCol w:w="4680"/>
+        <w:gridCol w:w="4680"/>
+      </w:tblGrid>
+      <w:tr>
+        <w:tc>
+          <w:tcPr>
+            <w:tcW w:type="dxa" w:w="3090"/>
+          </w:tcPr>
+          <w:p>
+            <w:r>
+              <w:rPr>
+                <w:b/>
+              </w:rPr>
+              <w:t>Pregunta</w:t>
+            </w:r>
+          </w:p>
+        </w:tc>
+        <w:tc>
+          <w:tcPr>
+            <w:tcW w:type="dxa" w:w="6270"/>
+          </w:tcPr>
+          <w:p>
+            <w:r>
+              <w:rPr>
+                <w:b/>
+              </w:rPr>
+              <w:t>Respuesta</w:t>
+            </w:r>
+          </w:p>
+        </w:tc>
+      </w:tr>
+      <w:tr>
+        <w:tc>
+          <w:tcPr>
+            <w:tcW w:type="dxa" w:w="3090"/>
+          </w:tcPr>
+          <w:p>
+            <w:r>
+              <w:t>¿Cómo reacciona el color al equipo elegido?</w:t>
+            </w:r>
+          </w:p>
+        </w:tc>
+        <w:tc>
+          <w:tcPr>
+            <w:tcW w:type="dxa" w:w="6270"/>
+          </w:tcPr>
+          <w:p>
+            <w:r>
+              <w:t>Al seleccionar, colors.js extrae el color de la bandera y se fijan variables CSS (--dash-accent, --dash-bg, --dash-inner) en root, así fondo y tarjeta se tiñen juntos.</w:t>
+            </w:r>
+          </w:p>
+        </w:tc>
+      </w:tr>
+      <w:tr>
+        <w:tc>
+          <w:tcPr>
+            <w:tcW w:type="dxa" w:w="3090"/>
+          </w:tcPr>
+          <w:p>
+            <w:r>
+              <w:t>¿Cómo se persiste el equipo favorito?</w:t>
+            </w:r>
+          </w:p>
+        </w:tc>
+        <w:tc>
+          <w:tcPr>
+            <w:tcW w:type="dxa" w:w="6270"/>
+          </w:tcPr>
+          <w:p>
+            <w:r>
+              <w:t>Con FAV_KEY='favTeam' y COL_KEY='favColor' en localStorage; al volver se restaura el equipo y su color.</w:t>
+            </w:r>
+          </w:p>
+        </w:tc>
+      </w:tr>
+      <w:tr>
+        <w:tc>
+          <w:tcPr>
+            <w:tcW w:type="dxa" w:w="3090"/>
+          </w:tcPr>
+          <w:p>
+            <w:r>
+              <w:t>¿Qué información muestra del equipo?</w:t>
+            </w:r>
+          </w:p>
+        </w:tc>
+        <w:tc>
+          <w:tcPr>
+            <w:tcW w:type="dxa" w:w="6270"/>
+          </w:tcPr>
+          <w:p>
+            <w:r>
+              <w:t>Sus partidos, su posición de grupo y un estado (vivo/eliminado/campeón), con confeti al elegirlo.</w:t>
+            </w:r>
+          </w:p>
+        </w:tc>
+      </w:tr>
+    </w:tbl>
+    <w:p>
       <w:pPr>
         <w:pStyle w:val="Ttulo2"/>
         <w:spacing w:before="220" w:after="90"/>
@@ -15910,6 +16996,119 @@
                 <w:szCs w:val="20"/>
               </w:rPr>
               <w:t xml:space="preserve"> tolerantes para nombres de equipo, nombre de grupo y nombres de los lados de un partido de eliminatoria.</w:t>
+            </w:r>
+          </w:p>
+        </w:tc>
+      </w:tr>
+    </w:tbl>
+    <w:p>
+      <w:r>
+        <w:rPr>
+          <w:b/>
+        </w:rPr>
+        <w:t>Posibles preguntas (defensa):</w:t>
+      </w:r>
+    </w:p>
+    <w:tbl>
+      <w:tblPr>
+        <w:tblW w:type="auto" w:w="0"/>
+        <w:tblLayout w:type="autofit"/>
+        <w:tblLook w:firstColumn="1" w:firstRow="1" w:lastColumn="0" w:lastRow="0" w:noHBand="0" w:noVBand="1" w:val="04A0"/>
+      </w:tblPr>
+      <w:tblGrid>
+        <w:gridCol w:w="4680"/>
+        <w:gridCol w:w="4680"/>
+      </w:tblGrid>
+      <w:tr>
+        <w:tc>
+          <w:tcPr>
+            <w:tcW w:type="dxa" w:w="3090"/>
+          </w:tcPr>
+          <w:p>
+            <w:r>
+              <w:rPr>
+                <w:b/>
+              </w:rPr>
+              <w:t>Pregunta</w:t>
+            </w:r>
+          </w:p>
+        </w:tc>
+        <w:tc>
+          <w:tcPr>
+            <w:tcW w:type="dxa" w:w="6270"/>
+          </w:tcPr>
+          <w:p>
+            <w:r>
+              <w:rPr>
+                <w:b/>
+              </w:rPr>
+              <w:t>Respuesta</w:t>
+            </w:r>
+          </w:p>
+        </w:tc>
+      </w:tr>
+      <w:tr>
+        <w:tc>
+          <w:tcPr>
+            <w:tcW w:type="dxa" w:w="3090"/>
+          </w:tcPr>
+          <w:p>
+            <w:r>
+              <w:t>¿Cómo se arma la matriz 4x4?</w:t>
+            </w:r>
+          </w:p>
+        </w:tc>
+        <w:tc>
+          <w:tcPr>
+            <w:tcW w:type="dxa" w:w="6270"/>
+          </w:tcPr>
+          <w:p>
+            <w:r>
+              <w:t>Por grupo, una fila y una columna por equipo con la diagonal deshabilitada; las celdas parten en "Pendiente" y sólo se parchean las jugadas con su resultado.</w:t>
+            </w:r>
+          </w:p>
+        </w:tc>
+      </w:tr>
+      <w:tr>
+        <w:tc>
+          <w:tcPr>
+            <w:tcW w:type="dxa" w:w="3090"/>
+          </w:tcPr>
+          <w:p>
+            <w:r>
+              <w:t>¿Por qué separar construir la matriz de parchear resultados?</w:t>
+            </w:r>
+          </w:p>
+        </w:tc>
+        <w:tc>
+          <w:tcPr>
+            <w:tcW w:type="dxa" w:w="6270"/>
+          </w:tcPr>
+          <w:p>
+            <w:r>
+              <w:t>Para no reconstruir el DOM: buildMatrix crea la estructura una vez y patchCell actualiza sólo las celdas jugadas (más eficiente y claro).</w:t>
+            </w:r>
+          </w:p>
+        </w:tc>
+      </w:tr>
+      <w:tr>
+        <w:tc>
+          <w:tcPr>
+            <w:tcW w:type="dxa" w:w="3090"/>
+          </w:tcPr>
+          <w:p>
+            <w:r>
+              <w:t>¿Cómo lograste el layout centrado en dos columnas responsive?</w:t>
+            </w:r>
+          </w:p>
+        </w:tc>
+        <w:tc>
+          <w:tcPr>
+            <w:tcW w:type="dxa" w:w="6270"/>
+          </w:tcPr>
+          <w:p>
+            <w:r>
+              <w:t>El contenedor usa 'columns is-multiline is-centered matriz-cols' con ancho máximo; grupos y rondas van en cards is-half que en móvil se apilan y centran su contenido.</w:t>
             </w:r>
           </w:p>
         </w:tc>

</xml_diff>